<commit_message>
fixed hours removed drafts folder
</commit_message>
<xml_diff>
--- a/flow/20230927_hours/свято-08-НЮ.docx
+++ b/flow/20230927_hours/свято-08-НЮ.docx
@@ -21,7 +21,7 @@
     </w:p>
     <w:p>
       <w:pPr>
-        <w:pStyle w:val="1"/>
+        <w:pStyle w:val="Heading1"/>
         <w:rPr>
           <w:rFonts w:ascii="Times New Roman" w:eastAsia="Times New Roman" w:hAnsi="Times New Roman" w:cs="Times New Roman"/>
           <w:sz w:val="24"/>
@@ -39,7 +39,7 @@
     </w:p>
     <w:p>
       <w:pPr>
-        <w:pStyle w:val="2"/>
+        <w:pStyle w:val="Heading2"/>
         <w:rPr>
           <w:rFonts w:ascii="Times New Roman" w:eastAsia="Times New Roman" w:hAnsi="Times New Roman" w:cs="Times New Roman"/>
           <w:sz w:val="24"/>
@@ -203,7 +203,7 @@
     </w:p>
     <w:p>
       <w:pPr>
-        <w:pStyle w:val="1"/>
+        <w:pStyle w:val="Heading1"/>
         <w:rPr>
           <w:rFonts w:ascii="Times New Roman" w:eastAsia="Times New Roman" w:hAnsi="Times New Roman" w:cs="Times New Roman"/>
           <w:sz w:val="24"/>
@@ -223,7 +223,7 @@
     </w:p>
     <w:p>
       <w:pPr>
-        <w:pStyle w:val="2"/>
+        <w:pStyle w:val="Heading2"/>
         <w:rPr>
           <w:rFonts w:ascii="Times New Roman" w:eastAsia="Times New Roman" w:hAnsi="Times New Roman" w:cs="Times New Roman"/>
           <w:sz w:val="24"/>
@@ -259,41 +259,29 @@
         </w:rPr>
         <w:t xml:space="preserve">Тропар (г. 4): </w:t>
       </w:r>
-      <w:proofErr w:type="spellStart"/>
-      <w:r>
-        <w:rPr>
-          <w:rFonts w:ascii="Times New Roman" w:eastAsia="Times New Roman" w:hAnsi="Times New Roman" w:cs="Times New Roman"/>
-          <w:sz w:val="24"/>
-          <w:szCs w:val="24"/>
-        </w:rPr>
-        <w:t>Ідімо</w:t>
-      </w:r>
-      <w:proofErr w:type="spellEnd"/>
-      <w:r>
-        <w:rPr>
-          <w:rFonts w:ascii="Times New Roman" w:eastAsia="Times New Roman" w:hAnsi="Times New Roman" w:cs="Times New Roman"/>
-          <w:sz w:val="24"/>
-          <w:szCs w:val="24"/>
-        </w:rPr>
-        <w:t xml:space="preserve"> назустріч Христовому </w:t>
-      </w:r>
-      <w:proofErr w:type="spellStart"/>
-      <w:r>
-        <w:rPr>
-          <w:rFonts w:ascii="Times New Roman" w:eastAsia="Times New Roman" w:hAnsi="Times New Roman" w:cs="Times New Roman"/>
-          <w:sz w:val="24"/>
-          <w:szCs w:val="24"/>
-        </w:rPr>
-        <w:t>перебраженню</w:t>
-      </w:r>
-      <w:proofErr w:type="spellEnd"/>
-      <w:r>
-        <w:rPr>
-          <w:rFonts w:ascii="Times New Roman" w:eastAsia="Times New Roman" w:hAnsi="Times New Roman" w:cs="Times New Roman"/>
-          <w:sz w:val="24"/>
-          <w:szCs w:val="24"/>
-        </w:rPr>
-        <w:t>,* світло торжествуючи, вірні, це передпразденство,* і кличмо: Надійшов день Божої радости,* восходить на гору Таворську Владика,* щоб засяяти красою Свого божества.</w:t>
+      <w:r>
+        <w:rPr>
+          <w:rFonts w:ascii="Times New Roman" w:eastAsia="Times New Roman" w:hAnsi="Times New Roman" w:cs="Times New Roman"/>
+          <w:sz w:val="24"/>
+          <w:szCs w:val="24"/>
+        </w:rPr>
+        <w:t>Ідімо назустріч Христовому пере</w:t>
+      </w:r>
+      <w:r>
+        <w:rPr>
+          <w:rFonts w:ascii="Times New Roman" w:eastAsia="Times New Roman" w:hAnsi="Times New Roman" w:cs="Times New Roman"/>
+          <w:sz w:val="24"/>
+          <w:szCs w:val="24"/>
+        </w:rPr>
+        <w:t>о</w:t>
+      </w:r>
+      <w:r>
+        <w:rPr>
+          <w:rFonts w:ascii="Times New Roman" w:eastAsia="Times New Roman" w:hAnsi="Times New Roman" w:cs="Times New Roman"/>
+          <w:sz w:val="24"/>
+          <w:szCs w:val="24"/>
+        </w:rPr>
+        <w:t>браженню,* світло торжествуючи, вірні, це передпразденство,* і кличмо: Надійшов день Божої радости,* восходить на гору Таворську Владика,* щоб засяяти красою Свого божества.</w:t>
       </w:r>
     </w:p>
     <w:p>
@@ -325,7 +313,7 @@
     </w:p>
     <w:p>
       <w:pPr>
-        <w:pStyle w:val="1"/>
+        <w:pStyle w:val="Heading1"/>
         <w:rPr>
           <w:rFonts w:ascii="Times New Roman" w:eastAsia="Times New Roman" w:hAnsi="Times New Roman" w:cs="Times New Roman"/>
           <w:color w:val="FF0000"/>
@@ -396,48 +384,12 @@
           <w:sz w:val="24"/>
           <w:szCs w:val="24"/>
         </w:rPr>
-        <w:t xml:space="preserve">На горі переобразився Ти,* і скільки змогли, ученики Твої славу Твою, Христе Боже, виділи,* щоб коли </w:t>
-      </w:r>
-      <w:proofErr w:type="spellStart"/>
-      <w:r>
-        <w:rPr>
-          <w:rFonts w:ascii="Times New Roman" w:eastAsia="Times New Roman" w:hAnsi="Times New Roman" w:cs="Times New Roman"/>
-          <w:sz w:val="24"/>
-          <w:szCs w:val="24"/>
-        </w:rPr>
-        <w:t>побачат</w:t>
-      </w:r>
-      <w:proofErr w:type="spellEnd"/>
-      <w:r>
-        <w:rPr>
-          <w:rFonts w:ascii="Times New Roman" w:eastAsia="Times New Roman" w:hAnsi="Times New Roman" w:cs="Times New Roman"/>
-          <w:sz w:val="24"/>
-          <w:szCs w:val="24"/>
-        </w:rPr>
-        <w:t xml:space="preserve">, як Тебе розпинають,* страждання зрозуміли добровільне,* а світові </w:t>
-      </w:r>
-      <w:proofErr w:type="spellStart"/>
-      <w:r>
-        <w:rPr>
-          <w:rFonts w:ascii="Times New Roman" w:eastAsia="Times New Roman" w:hAnsi="Times New Roman" w:cs="Times New Roman"/>
-          <w:sz w:val="24"/>
-          <w:szCs w:val="24"/>
-        </w:rPr>
-        <w:t>проповідять</w:t>
-      </w:r>
-      <w:proofErr w:type="spellEnd"/>
-      <w:r>
-        <w:rPr>
-          <w:rFonts w:ascii="Times New Roman" w:eastAsia="Times New Roman" w:hAnsi="Times New Roman" w:cs="Times New Roman"/>
-          <w:sz w:val="24"/>
-          <w:szCs w:val="24"/>
-        </w:rPr>
-        <w:t>,* що Ти єси воістину Отче сяяння.</w:t>
-      </w:r>
-    </w:p>
-    <w:p>
-      <w:pPr>
-        <w:pStyle w:val="1"/>
+        <w:t>На горі переобразився Ти,* і скільки змогли, ученики Твої славу Твою, Христе Боже, виділи,* щоб коли побачат, як Тебе розпинають,* страждання зрозуміли добровільне,* а світові проповідять,* що Ти єси воістину Отче сяяння.</w:t>
+      </w:r>
+    </w:p>
+    <w:p>
+      <w:pPr>
+        <w:pStyle w:val="Heading1"/>
         <w:rPr>
           <w:rFonts w:ascii="Times New Roman" w:eastAsia="Times New Roman" w:hAnsi="Times New Roman" w:cs="Times New Roman"/>
           <w:sz w:val="24"/>
@@ -504,48 +456,12 @@
           <w:sz w:val="24"/>
           <w:szCs w:val="24"/>
         </w:rPr>
-        <w:t xml:space="preserve">На горі переобразився Ти,* і скільки змогли, ученики Твої славу Твою, Христе Боже, виділи,* щоб коли </w:t>
-      </w:r>
-      <w:proofErr w:type="spellStart"/>
-      <w:r>
-        <w:rPr>
-          <w:rFonts w:ascii="Times New Roman" w:eastAsia="Times New Roman" w:hAnsi="Times New Roman" w:cs="Times New Roman"/>
-          <w:sz w:val="24"/>
-          <w:szCs w:val="24"/>
-        </w:rPr>
-        <w:t>побачат</w:t>
-      </w:r>
-      <w:proofErr w:type="spellEnd"/>
-      <w:r>
-        <w:rPr>
-          <w:rFonts w:ascii="Times New Roman" w:eastAsia="Times New Roman" w:hAnsi="Times New Roman" w:cs="Times New Roman"/>
-          <w:sz w:val="24"/>
-          <w:szCs w:val="24"/>
-        </w:rPr>
-        <w:t xml:space="preserve">, як Тебе розпинають,* страждання зрозуміли добровільне,* а світові </w:t>
-      </w:r>
-      <w:proofErr w:type="spellStart"/>
-      <w:r>
-        <w:rPr>
-          <w:rFonts w:ascii="Times New Roman" w:eastAsia="Times New Roman" w:hAnsi="Times New Roman" w:cs="Times New Roman"/>
-          <w:sz w:val="24"/>
-          <w:szCs w:val="24"/>
-        </w:rPr>
-        <w:t>проповідять</w:t>
-      </w:r>
-      <w:proofErr w:type="spellEnd"/>
-      <w:r>
-        <w:rPr>
-          <w:rFonts w:ascii="Times New Roman" w:eastAsia="Times New Roman" w:hAnsi="Times New Roman" w:cs="Times New Roman"/>
-          <w:sz w:val="24"/>
-          <w:szCs w:val="24"/>
-        </w:rPr>
-        <w:t>,* що Ти єси воістину Отче сяяння.</w:t>
-      </w:r>
-    </w:p>
-    <w:p>
-      <w:pPr>
-        <w:pStyle w:val="1"/>
+        <w:t>На горі переобразився Ти,* і скільки змогли, ученики Твої славу Твою, Христе Боже, виділи,* щоб коли побачат, як Тебе розпинають,* страждання зрозуміли добровільне,* а світові проповідять,* що Ти єси воістину Отче сяяння.</w:t>
+      </w:r>
+    </w:p>
+    <w:p>
+      <w:pPr>
+        <w:pStyle w:val="Heading1"/>
         <w:rPr>
           <w:rFonts w:ascii="Times New Roman" w:eastAsia="Times New Roman" w:hAnsi="Times New Roman" w:cs="Times New Roman"/>
           <w:sz w:val="24"/>
@@ -613,48 +529,12 @@
           <w:sz w:val="24"/>
           <w:szCs w:val="24"/>
         </w:rPr>
-        <w:t xml:space="preserve">На горі переобразився Ти,* і скільки змогли, ученики Твої славу Твою, Христе Боже, виділи,* щоб коли </w:t>
-      </w:r>
-      <w:proofErr w:type="spellStart"/>
-      <w:r>
-        <w:rPr>
-          <w:rFonts w:ascii="Times New Roman" w:eastAsia="Times New Roman" w:hAnsi="Times New Roman" w:cs="Times New Roman"/>
-          <w:sz w:val="24"/>
-          <w:szCs w:val="24"/>
-        </w:rPr>
-        <w:t>побачат</w:t>
-      </w:r>
-      <w:proofErr w:type="spellEnd"/>
-      <w:r>
-        <w:rPr>
-          <w:rFonts w:ascii="Times New Roman" w:eastAsia="Times New Roman" w:hAnsi="Times New Roman" w:cs="Times New Roman"/>
-          <w:sz w:val="24"/>
-          <w:szCs w:val="24"/>
-        </w:rPr>
-        <w:t xml:space="preserve">, як Тебе розпинають,* страждання зрозуміли добровільне,* а світові </w:t>
-      </w:r>
-      <w:proofErr w:type="spellStart"/>
-      <w:r>
-        <w:rPr>
-          <w:rFonts w:ascii="Times New Roman" w:eastAsia="Times New Roman" w:hAnsi="Times New Roman" w:cs="Times New Roman"/>
-          <w:sz w:val="24"/>
-          <w:szCs w:val="24"/>
-        </w:rPr>
-        <w:t>проповідять</w:t>
-      </w:r>
-      <w:proofErr w:type="spellEnd"/>
-      <w:r>
-        <w:rPr>
-          <w:rFonts w:ascii="Times New Roman" w:eastAsia="Times New Roman" w:hAnsi="Times New Roman" w:cs="Times New Roman"/>
-          <w:sz w:val="24"/>
-          <w:szCs w:val="24"/>
-        </w:rPr>
-        <w:t>,* що Ти єси воістину Отче сяяння.</w:t>
-      </w:r>
-    </w:p>
-    <w:p>
-      <w:pPr>
-        <w:pStyle w:val="1"/>
+        <w:t>На горі переобразився Ти,* і скільки змогли, ученики Твої славу Твою, Христе Боже, виділи,* щоб коли побачат, як Тебе розпинають,* страждання зрозуміли добровільне,* а світові проповідять,* що Ти єси воістину Отче сяяння.</w:t>
+      </w:r>
+    </w:p>
+    <w:p>
+      <w:pPr>
+        <w:pStyle w:val="Heading1"/>
         <w:rPr>
           <w:rFonts w:ascii="Times New Roman" w:eastAsia="Times New Roman" w:hAnsi="Times New Roman" w:cs="Times New Roman"/>
           <w:sz w:val="24"/>
@@ -721,48 +601,12 @@
           <w:sz w:val="24"/>
           <w:szCs w:val="24"/>
         </w:rPr>
-        <w:t xml:space="preserve">На горі переобразився Ти,* і скільки змогли, ученики Твої славу Твою, Христе Боже, виділи,* щоб коли </w:t>
-      </w:r>
-      <w:proofErr w:type="spellStart"/>
-      <w:r>
-        <w:rPr>
-          <w:rFonts w:ascii="Times New Roman" w:eastAsia="Times New Roman" w:hAnsi="Times New Roman" w:cs="Times New Roman"/>
-          <w:sz w:val="24"/>
-          <w:szCs w:val="24"/>
-        </w:rPr>
-        <w:t>побачат</w:t>
-      </w:r>
-      <w:proofErr w:type="spellEnd"/>
-      <w:r>
-        <w:rPr>
-          <w:rFonts w:ascii="Times New Roman" w:eastAsia="Times New Roman" w:hAnsi="Times New Roman" w:cs="Times New Roman"/>
-          <w:sz w:val="24"/>
-          <w:szCs w:val="24"/>
-        </w:rPr>
-        <w:t xml:space="preserve">, як Тебе розпинають,* страждання зрозуміли добровільне,* а світові </w:t>
-      </w:r>
-      <w:proofErr w:type="spellStart"/>
-      <w:r>
-        <w:rPr>
-          <w:rFonts w:ascii="Times New Roman" w:eastAsia="Times New Roman" w:hAnsi="Times New Roman" w:cs="Times New Roman"/>
-          <w:sz w:val="24"/>
-          <w:szCs w:val="24"/>
-        </w:rPr>
-        <w:t>проповідять</w:t>
-      </w:r>
-      <w:proofErr w:type="spellEnd"/>
-      <w:r>
-        <w:rPr>
-          <w:rFonts w:ascii="Times New Roman" w:eastAsia="Times New Roman" w:hAnsi="Times New Roman" w:cs="Times New Roman"/>
-          <w:sz w:val="24"/>
-          <w:szCs w:val="24"/>
-        </w:rPr>
-        <w:t>,* що Ти єси воістину Отче сяяння.</w:t>
-      </w:r>
-    </w:p>
-    <w:p>
-      <w:pPr>
-        <w:pStyle w:val="1"/>
+        <w:t>На горі переобразився Ти,* і скільки змогли, ученики Твої славу Твою, Христе Боже, виділи,* щоб коли побачат, як Тебе розпинають,* страждання зрозуміли добровільне,* а світові проповідять,* що Ти єси воістину Отче сяяння.</w:t>
+      </w:r>
+    </w:p>
+    <w:p>
+      <w:pPr>
+        <w:pStyle w:val="Heading1"/>
         <w:rPr>
           <w:rFonts w:ascii="Times New Roman" w:eastAsia="Times New Roman" w:hAnsi="Times New Roman" w:cs="Times New Roman"/>
           <w:sz w:val="24"/>
@@ -829,57 +673,21 @@
           <w:sz w:val="24"/>
           <w:szCs w:val="24"/>
         </w:rPr>
-        <w:t xml:space="preserve">На горі переобразився Ти,* і скільки змогли, ученики Твої славу Твою, Христе Боже, виділи,* щоб коли </w:t>
-      </w:r>
-      <w:proofErr w:type="spellStart"/>
-      <w:r>
-        <w:rPr>
-          <w:rFonts w:ascii="Times New Roman" w:eastAsia="Times New Roman" w:hAnsi="Times New Roman" w:cs="Times New Roman"/>
-          <w:sz w:val="24"/>
-          <w:szCs w:val="24"/>
-        </w:rPr>
-        <w:t>побачат</w:t>
-      </w:r>
-      <w:proofErr w:type="spellEnd"/>
-      <w:r>
-        <w:rPr>
-          <w:rFonts w:ascii="Times New Roman" w:eastAsia="Times New Roman" w:hAnsi="Times New Roman" w:cs="Times New Roman"/>
-          <w:sz w:val="24"/>
-          <w:szCs w:val="24"/>
-        </w:rPr>
-        <w:t xml:space="preserve">, як Тебе розпинають,* страждання зрозуміли добровільне,* а світові </w:t>
-      </w:r>
-      <w:proofErr w:type="spellStart"/>
-      <w:r>
-        <w:rPr>
-          <w:rFonts w:ascii="Times New Roman" w:eastAsia="Times New Roman" w:hAnsi="Times New Roman" w:cs="Times New Roman"/>
-          <w:sz w:val="24"/>
-          <w:szCs w:val="24"/>
-        </w:rPr>
-        <w:t>проповідять</w:t>
-      </w:r>
-      <w:proofErr w:type="spellEnd"/>
-      <w:r>
-        <w:rPr>
-          <w:rFonts w:ascii="Times New Roman" w:eastAsia="Times New Roman" w:hAnsi="Times New Roman" w:cs="Times New Roman"/>
-          <w:sz w:val="24"/>
-          <w:szCs w:val="24"/>
-        </w:rPr>
-        <w:t>,* що Ти єси воістину Отче сяяння.</w:t>
-      </w:r>
-    </w:p>
-    <w:p>
-      <w:pPr>
-        <w:rPr>
-          <w:rFonts w:ascii="Times New Roman" w:eastAsia="Times New Roman" w:hAnsi="Times New Roman" w:cs="Times New Roman"/>
-          <w:sz w:val="24"/>
-          <w:szCs w:val="24"/>
-        </w:rPr>
-      </w:pPr>
-    </w:p>
-    <w:p>
-      <w:pPr>
-        <w:pStyle w:val="1"/>
+        <w:t>На горі переобразився Ти,* і скільки змогли, ученики Твої славу Твою, Христе Боже, виділи,* щоб коли побачат, як Тебе розпинають,* страждання зрозуміли добровільне,* а світові проповідять,* що Ти єси воістину Отче сяяння.</w:t>
+      </w:r>
+    </w:p>
+    <w:p>
+      <w:pPr>
+        <w:rPr>
+          <w:rFonts w:ascii="Times New Roman" w:eastAsia="Times New Roman" w:hAnsi="Times New Roman" w:cs="Times New Roman"/>
+          <w:sz w:val="24"/>
+          <w:szCs w:val="24"/>
+        </w:rPr>
+      </w:pPr>
+    </w:p>
+    <w:p>
+      <w:pPr>
+        <w:pStyle w:val="Heading1"/>
         <w:rPr>
           <w:rFonts w:ascii="Times New Roman" w:eastAsia="Times New Roman" w:hAnsi="Times New Roman" w:cs="Times New Roman"/>
           <w:sz w:val="24"/>
@@ -946,48 +754,12 @@
           <w:sz w:val="24"/>
           <w:szCs w:val="24"/>
         </w:rPr>
-        <w:t xml:space="preserve">На горі переобразився Ти,* і скільки змогли, ученики Твої славу Твою, Христе Боже, виділи,* щоб коли </w:t>
-      </w:r>
-      <w:proofErr w:type="spellStart"/>
-      <w:r>
-        <w:rPr>
-          <w:rFonts w:ascii="Times New Roman" w:eastAsia="Times New Roman" w:hAnsi="Times New Roman" w:cs="Times New Roman"/>
-          <w:sz w:val="24"/>
-          <w:szCs w:val="24"/>
-        </w:rPr>
-        <w:t>побачат</w:t>
-      </w:r>
-      <w:proofErr w:type="spellEnd"/>
-      <w:r>
-        <w:rPr>
-          <w:rFonts w:ascii="Times New Roman" w:eastAsia="Times New Roman" w:hAnsi="Times New Roman" w:cs="Times New Roman"/>
-          <w:sz w:val="24"/>
-          <w:szCs w:val="24"/>
-        </w:rPr>
-        <w:t xml:space="preserve">, як Тебе розпинають,* страждання зрозуміли добровільне,* а світові </w:t>
-      </w:r>
-      <w:proofErr w:type="spellStart"/>
-      <w:r>
-        <w:rPr>
-          <w:rFonts w:ascii="Times New Roman" w:eastAsia="Times New Roman" w:hAnsi="Times New Roman" w:cs="Times New Roman"/>
-          <w:sz w:val="24"/>
-          <w:szCs w:val="24"/>
-        </w:rPr>
-        <w:t>проповідять</w:t>
-      </w:r>
-      <w:proofErr w:type="spellEnd"/>
-      <w:r>
-        <w:rPr>
-          <w:rFonts w:ascii="Times New Roman" w:eastAsia="Times New Roman" w:hAnsi="Times New Roman" w:cs="Times New Roman"/>
-          <w:sz w:val="24"/>
-          <w:szCs w:val="24"/>
-        </w:rPr>
-        <w:t>,* що Ти єси воістину Отче сяяння.</w:t>
-      </w:r>
-    </w:p>
-    <w:p>
-      <w:pPr>
-        <w:pStyle w:val="1"/>
+        <w:t>На горі переобразився Ти,* і скільки змогли, ученики Твої славу Твою, Христе Боже, виділи,* щоб коли побачат, як Тебе розпинають,* страждання зрозуміли добровільне,* а світові проповідять,* що Ти єси воістину Отче сяяння.</w:t>
+      </w:r>
+    </w:p>
+    <w:p>
+      <w:pPr>
+        <w:pStyle w:val="Heading1"/>
         <w:rPr>
           <w:rFonts w:ascii="Times New Roman" w:eastAsia="Times New Roman" w:hAnsi="Times New Roman" w:cs="Times New Roman"/>
           <w:sz w:val="24"/>
@@ -1019,15 +791,15 @@
           <w:sz w:val="24"/>
           <w:szCs w:val="24"/>
         </w:rPr>
-        <w:t xml:space="preserve">Тропар (г. 4): </w:t>
-      </w:r>
-      <w:r>
-        <w:rPr>
-          <w:rFonts w:ascii="Times New Roman" w:eastAsia="Times New Roman" w:hAnsi="Times New Roman" w:cs="Times New Roman"/>
-          <w:sz w:val="24"/>
-          <w:szCs w:val="24"/>
-        </w:rPr>
-        <w:t>Мученики Твої, Господи,* у стражданнях своїх прийняли вінець нетлінний від Тебе, Бога нашого,* мавши бо кріпость Твою, вони мучителів подолали,* сокрушили і демонів зухвальства безсильні.* Їх молитвами спаси душі наші.</w:t>
+        <w:t xml:space="preserve">Тропар (г. 7): </w:t>
+      </w:r>
+      <w:r>
+        <w:rPr>
+          <w:rFonts w:ascii="Times New Roman" w:eastAsia="Times New Roman" w:hAnsi="Times New Roman" w:cs="Times New Roman"/>
+          <w:sz w:val="24"/>
+          <w:szCs w:val="24"/>
+        </w:rPr>
+        <w:t>Переобразився Ти на горі, Христе Боже,* показавши ученикам Твоїм славу Твою, скільки змогли,* Нехай засіяє і нам, грішним, світло Твоє повсякчасне,* молитвами Богородиці, Світлодавче, слава Тобі.</w:t>
       </w:r>
     </w:p>
     <w:p>
@@ -1047,38 +819,20 @@
           <w:szCs w:val="24"/>
         </w:rPr>
         <w:lastRenderedPageBreak/>
-        <w:t xml:space="preserve">Кондак (г. 4): </w:t>
-      </w:r>
-      <w:r>
-        <w:rPr>
-          <w:rFonts w:ascii="Times New Roman" w:eastAsia="Times New Roman" w:hAnsi="Times New Roman" w:cs="Times New Roman"/>
-          <w:sz w:val="24"/>
-          <w:szCs w:val="24"/>
-        </w:rPr>
-        <w:t xml:space="preserve">Скинувши ворожі приношення* терпінням сильних мук, Страстотерпці,* на небесах живете нині, радіючи,* Фотію славний і </w:t>
-      </w:r>
-      <w:proofErr w:type="spellStart"/>
-      <w:r>
-        <w:rPr>
-          <w:rFonts w:ascii="Times New Roman" w:eastAsia="Times New Roman" w:hAnsi="Times New Roman" w:cs="Times New Roman"/>
-          <w:sz w:val="24"/>
-          <w:szCs w:val="24"/>
-        </w:rPr>
-        <w:t>Аникито</w:t>
-      </w:r>
-      <w:proofErr w:type="spellEnd"/>
-      <w:r>
-        <w:rPr>
-          <w:rFonts w:ascii="Times New Roman" w:eastAsia="Times New Roman" w:hAnsi="Times New Roman" w:cs="Times New Roman"/>
-          <w:sz w:val="24"/>
-          <w:szCs w:val="24"/>
-        </w:rPr>
-        <w:t xml:space="preserve"> блаженний.* Тому й перебуваєте у славі на віки віків,* молячись Христові за нас, що творимо вашу пам’ять. </w:t>
-      </w:r>
-    </w:p>
-    <w:p>
-      <w:pPr>
-        <w:pStyle w:val="1"/>
+        <w:t xml:space="preserve">Кондак (г. 7): </w:t>
+      </w:r>
+      <w:r>
+        <w:rPr>
+          <w:rFonts w:ascii="Times New Roman" w:eastAsia="Times New Roman" w:hAnsi="Times New Roman" w:cs="Times New Roman"/>
+          <w:sz w:val="24"/>
+          <w:szCs w:val="24"/>
+        </w:rPr>
+        <w:t>На горі переобразився Ти,* і скільки змогли, ученики Твої славу Твою, Христе Боже, виділи,* щоб коли побачат, як Тебе розпинають,* страждання зрозуміли добровільне,* а світові проповідять,* що Ти єси воістину Отче сяяння.</w:t>
+      </w:r>
+    </w:p>
+    <w:p>
+      <w:pPr>
+        <w:pStyle w:val="Heading1"/>
         <w:rPr>
           <w:rFonts w:ascii="Times New Roman" w:eastAsia="Times New Roman" w:hAnsi="Times New Roman" w:cs="Times New Roman"/>
           <w:sz w:val="24"/>
@@ -1145,48 +899,12 @@
           <w:sz w:val="24"/>
           <w:szCs w:val="24"/>
         </w:rPr>
-        <w:t xml:space="preserve">На горі переобразився Ти,* і скільки змогли, ученики Твої славу Твою, Христе Боже, виділи,* щоб коли </w:t>
-      </w:r>
-      <w:proofErr w:type="spellStart"/>
-      <w:r>
-        <w:rPr>
-          <w:rFonts w:ascii="Times New Roman" w:eastAsia="Times New Roman" w:hAnsi="Times New Roman" w:cs="Times New Roman"/>
-          <w:sz w:val="24"/>
-          <w:szCs w:val="24"/>
-        </w:rPr>
-        <w:t>побачат</w:t>
-      </w:r>
-      <w:proofErr w:type="spellEnd"/>
-      <w:r>
-        <w:rPr>
-          <w:rFonts w:ascii="Times New Roman" w:eastAsia="Times New Roman" w:hAnsi="Times New Roman" w:cs="Times New Roman"/>
-          <w:sz w:val="24"/>
-          <w:szCs w:val="24"/>
-        </w:rPr>
-        <w:t xml:space="preserve">, як Тебе розпинають,* страждання зрозуміли добровільне,* а світові </w:t>
-      </w:r>
-      <w:proofErr w:type="spellStart"/>
-      <w:r>
-        <w:rPr>
-          <w:rFonts w:ascii="Times New Roman" w:eastAsia="Times New Roman" w:hAnsi="Times New Roman" w:cs="Times New Roman"/>
-          <w:sz w:val="24"/>
-          <w:szCs w:val="24"/>
-        </w:rPr>
-        <w:t>проповідять</w:t>
-      </w:r>
-      <w:proofErr w:type="spellEnd"/>
-      <w:r>
-        <w:rPr>
-          <w:rFonts w:ascii="Times New Roman" w:eastAsia="Times New Roman" w:hAnsi="Times New Roman" w:cs="Times New Roman"/>
-          <w:sz w:val="24"/>
-          <w:szCs w:val="24"/>
-        </w:rPr>
-        <w:t>,* що Ти єси воістину Отче сяяння.</w:t>
-      </w:r>
-    </w:p>
-    <w:p>
-      <w:pPr>
-        <w:pStyle w:val="1"/>
+        <w:t>На горі переобразився Ти,* і скільки змогли, ученики Твої славу Твою, Христе Боже, виділи,* щоб коли побачат, як Тебе розпинають,* страждання зрозуміли добровільне,* а світові проповідять,* що Ти єси воістину Отче сяяння.</w:t>
+      </w:r>
+    </w:p>
+    <w:p>
+      <w:pPr>
+        <w:pStyle w:val="Heading1"/>
         <w:rPr>
           <w:rFonts w:ascii="Times New Roman" w:eastAsia="Times New Roman" w:hAnsi="Times New Roman" w:cs="Times New Roman"/>
           <w:color w:val="FF0000"/>
@@ -1205,7 +923,7 @@
     </w:p>
     <w:p>
       <w:pPr>
-        <w:pStyle w:val="2"/>
+        <w:pStyle w:val="Heading2"/>
         <w:rPr>
           <w:rFonts w:ascii="Times New Roman" w:eastAsia="Times New Roman" w:hAnsi="Times New Roman" w:cs="Times New Roman"/>
           <w:sz w:val="24"/>
@@ -1279,7 +997,7 @@
     </w:p>
     <w:p>
       <w:pPr>
-        <w:pStyle w:val="1"/>
+        <w:pStyle w:val="Heading1"/>
         <w:rPr>
           <w:rFonts w:ascii="Times New Roman" w:eastAsia="Times New Roman" w:hAnsi="Times New Roman" w:cs="Times New Roman"/>
           <w:color w:val="FF0000"/>
@@ -1355,7 +1073,7 @@
     </w:p>
     <w:p>
       <w:pPr>
-        <w:pStyle w:val="1"/>
+        <w:pStyle w:val="Heading1"/>
         <w:rPr>
           <w:rFonts w:ascii="Times New Roman" w:eastAsia="Times New Roman" w:hAnsi="Times New Roman" w:cs="Times New Roman"/>
           <w:color w:val="FF0000"/>
@@ -1432,7 +1150,7 @@
     </w:p>
     <w:p>
       <w:pPr>
-        <w:pStyle w:val="1"/>
+        <w:pStyle w:val="Heading1"/>
         <w:rPr>
           <w:rFonts w:ascii="Times New Roman" w:eastAsia="Times New Roman" w:hAnsi="Times New Roman" w:cs="Times New Roman"/>
           <w:color w:val="FF0000"/>
@@ -1506,7 +1224,7 @@
     </w:p>
     <w:p>
       <w:pPr>
-        <w:pStyle w:val="1"/>
+        <w:pStyle w:val="Heading1"/>
         <w:rPr>
           <w:rFonts w:ascii="Times New Roman" w:eastAsia="Times New Roman" w:hAnsi="Times New Roman" w:cs="Times New Roman"/>
           <w:color w:val="FF0000"/>
@@ -1588,7 +1306,7 @@
     </w:p>
     <w:p>
       <w:pPr>
-        <w:pStyle w:val="1"/>
+        <w:pStyle w:val="Heading1"/>
         <w:spacing w:before="200" w:line="240" w:lineRule="auto"/>
         <w:rPr>
           <w:rFonts w:ascii="Times New Roman" w:eastAsia="Times New Roman" w:hAnsi="Times New Roman" w:cs="Times New Roman"/>
@@ -1665,7 +1383,7 @@
     </w:p>
     <w:p>
       <w:pPr>
-        <w:pStyle w:val="1"/>
+        <w:pStyle w:val="Heading1"/>
         <w:spacing w:before="200" w:line="240" w:lineRule="auto"/>
         <w:rPr>
           <w:rFonts w:ascii="Times New Roman" w:eastAsia="Times New Roman" w:hAnsi="Times New Roman" w:cs="Times New Roman"/>
@@ -1740,7 +1458,7 @@
     </w:p>
     <w:p>
       <w:pPr>
-        <w:pStyle w:val="1"/>
+        <w:pStyle w:val="Heading1"/>
         <w:spacing w:before="200" w:line="240" w:lineRule="auto"/>
         <w:rPr>
           <w:rFonts w:ascii="Times New Roman" w:eastAsia="Times New Roman" w:hAnsi="Times New Roman" w:cs="Times New Roman"/>
@@ -1827,7 +1545,7 @@
     </w:p>
     <w:p>
       <w:pPr>
-        <w:pStyle w:val="1"/>
+        <w:pStyle w:val="Heading1"/>
         <w:spacing w:before="200" w:line="240" w:lineRule="auto"/>
         <w:rPr>
           <w:rFonts w:ascii="Times New Roman" w:eastAsia="Times New Roman" w:hAnsi="Times New Roman" w:cs="Times New Roman"/>
@@ -1906,14 +1624,31 @@
         <w:spacing w:before="200" w:after="0" w:line="240" w:lineRule="auto"/>
         <w:rPr>
           <w:rFonts w:ascii="Times New Roman" w:eastAsia="Times New Roman" w:hAnsi="Times New Roman" w:cs="Times New Roman"/>
-          <w:sz w:val="24"/>
-          <w:szCs w:val="24"/>
-        </w:rPr>
-      </w:pPr>
-    </w:p>
-    <w:p>
-      <w:pPr>
-        <w:pStyle w:val="1"/>
+          <w:b/>
+          <w:bCs/>
+          <w:i/>
+          <w:iCs/>
+          <w:sz w:val="24"/>
+          <w:szCs w:val="24"/>
+        </w:rPr>
+      </w:pPr>
+      <w:r>
+        <w:rPr>
+          <w:rFonts w:ascii="Times New Roman" w:eastAsia="Times New Roman" w:hAnsi="Times New Roman" w:cs="Times New Roman"/>
+          <w:b/>
+          <w:bCs/>
+          <w:i/>
+          <w:iCs/>
+          <w:color w:val="0070C0"/>
+          <w:sz w:val="24"/>
+          <w:szCs w:val="24"/>
+        </w:rPr>
+        <w:t>ТРЕБА ДОДАТИ ЛУППА</w:t>
+      </w:r>
+    </w:p>
+    <w:p>
+      <w:pPr>
+        <w:pStyle w:val="Heading1"/>
         <w:spacing w:before="200" w:line="240" w:lineRule="auto"/>
         <w:rPr>
           <w:rFonts w:ascii="Times New Roman" w:eastAsia="Times New Roman" w:hAnsi="Times New Roman" w:cs="Times New Roman"/>
@@ -1985,32 +1720,14 @@
           <w:sz w:val="24"/>
           <w:szCs w:val="24"/>
         </w:rPr>
-        <w:t xml:space="preserve">В молитвах невсипущу Богородицю* і в заступництвах незамінне уповання* гріб і умертвіння не втримали.* Бо як Матір Життя до життя переставив Той,* Хто вселився в утробу </w:t>
-      </w:r>
-      <w:proofErr w:type="spellStart"/>
-      <w:r>
-        <w:rPr>
-          <w:rFonts w:ascii="Times New Roman" w:eastAsia="Times New Roman" w:hAnsi="Times New Roman" w:cs="Times New Roman"/>
-          <w:sz w:val="24"/>
-          <w:szCs w:val="24"/>
-        </w:rPr>
-        <w:t>приснодівственну</w:t>
-      </w:r>
-      <w:proofErr w:type="spellEnd"/>
-      <w:r>
-        <w:rPr>
-          <w:rFonts w:ascii="Times New Roman" w:eastAsia="Times New Roman" w:hAnsi="Times New Roman" w:cs="Times New Roman"/>
-          <w:sz w:val="24"/>
-          <w:szCs w:val="24"/>
-        </w:rPr>
-        <w:t>.</w:t>
+        <w:t>В молитвах невсипущу Богородицю* і в заступництвах незамінне уповання* гріб і умертвіння не втримали.* Бо як Матір Життя до життя переставив Той,* Хто вселився в утробу приснодівственну.</w:t>
       </w:r>
       <w:bookmarkStart w:id="16" w:name="_heading=h.ap76o6m9a0cm" w:colFirst="0" w:colLast="0"/>
       <w:bookmarkEnd w:id="16"/>
     </w:p>
     <w:p>
       <w:pPr>
-        <w:pStyle w:val="1"/>
+        <w:pStyle w:val="Heading1"/>
         <w:spacing w:before="200" w:line="240" w:lineRule="auto"/>
         <w:rPr>
           <w:rFonts w:ascii="Times New Roman" w:eastAsia="Times New Roman" w:hAnsi="Times New Roman" w:cs="Times New Roman"/>
@@ -2025,30 +1742,12 @@
           <w:sz w:val="24"/>
           <w:szCs w:val="24"/>
         </w:rPr>
-        <w:t xml:space="preserve">30 серпня.  </w:t>
-      </w:r>
-      <w:proofErr w:type="spellStart"/>
-      <w:r>
-        <w:rPr>
-          <w:rFonts w:ascii="Times New Roman" w:eastAsia="Times New Roman" w:hAnsi="Times New Roman" w:cs="Times New Roman"/>
-          <w:sz w:val="24"/>
-          <w:szCs w:val="24"/>
-        </w:rPr>
-        <w:t>Свв</w:t>
-      </w:r>
-      <w:proofErr w:type="spellEnd"/>
-      <w:r>
-        <w:rPr>
-          <w:rFonts w:ascii="Times New Roman" w:eastAsia="Times New Roman" w:hAnsi="Times New Roman" w:cs="Times New Roman"/>
-          <w:sz w:val="24"/>
-          <w:szCs w:val="24"/>
-        </w:rPr>
-        <w:t>. патріархів Царгородських, Олександра, Йоана і Павла Нового.</w:t>
-      </w:r>
-    </w:p>
-    <w:p>
-      <w:pPr>
-        <w:pStyle w:val="2"/>
+        <w:t>30 серпня.  Свв. патріархів Царгородських, Олександра, Йоана і Павла Нового.</w:t>
+      </w:r>
+    </w:p>
+    <w:p>
+      <w:pPr>
+        <w:pStyle w:val="Heading2"/>
         <w:spacing w:before="200" w:line="240" w:lineRule="auto"/>
         <w:rPr>
           <w:rFonts w:ascii="Times New Roman" w:eastAsia="Times New Roman" w:hAnsi="Times New Roman" w:cs="Times New Roman"/>
@@ -2062,25 +1761,14 @@
       <w:bookmarkStart w:id="19" w:name="_heading=h.lo5tv7vkfm2a" w:colFirst="0" w:colLast="0"/>
       <w:bookmarkEnd w:id="18"/>
       <w:bookmarkEnd w:id="19"/>
-      <w:proofErr w:type="spellStart"/>
-      <w:r>
-        <w:rPr>
-          <w:rFonts w:ascii="Times New Roman" w:eastAsia="Times New Roman" w:hAnsi="Times New Roman" w:cs="Times New Roman"/>
-          <w:i/>
-          <w:sz w:val="24"/>
-          <w:szCs w:val="24"/>
-        </w:rPr>
-        <w:t>Посвяття</w:t>
-      </w:r>
-      <w:proofErr w:type="spellEnd"/>
-      <w:r>
-        <w:rPr>
-          <w:rFonts w:ascii="Times New Roman" w:eastAsia="Times New Roman" w:hAnsi="Times New Roman" w:cs="Times New Roman"/>
-          <w:i/>
-          <w:sz w:val="24"/>
-          <w:szCs w:val="24"/>
-        </w:rPr>
-        <w:t xml:space="preserve"> Усікновення </w:t>
+      <w:r>
+        <w:rPr>
+          <w:rFonts w:ascii="Times New Roman" w:eastAsia="Times New Roman" w:hAnsi="Times New Roman" w:cs="Times New Roman"/>
+          <w:i/>
+          <w:sz w:val="24"/>
+          <w:szCs w:val="24"/>
+        </w:rPr>
+        <w:t xml:space="preserve">Посвяття Усікновення </w:t>
       </w:r>
       <w:r>
         <w:rPr>
@@ -2119,79 +1807,7 @@
           <w:sz w:val="24"/>
           <w:szCs w:val="24"/>
         </w:rPr>
-        <w:t xml:space="preserve">Пам’ять праведного з похвалами,* і тобі вистачає свідчення Господнє, </w:t>
-      </w:r>
-      <w:proofErr w:type="spellStart"/>
-      <w:r>
-        <w:rPr>
-          <w:rFonts w:ascii="Times New Roman" w:eastAsia="Times New Roman" w:hAnsi="Times New Roman" w:cs="Times New Roman"/>
-          <w:sz w:val="24"/>
-          <w:szCs w:val="24"/>
-        </w:rPr>
-        <w:t>Предтече</w:t>
-      </w:r>
-      <w:proofErr w:type="spellEnd"/>
-      <w:r>
-        <w:rPr>
-          <w:rFonts w:ascii="Times New Roman" w:eastAsia="Times New Roman" w:hAnsi="Times New Roman" w:cs="Times New Roman"/>
-          <w:sz w:val="24"/>
-          <w:szCs w:val="24"/>
-        </w:rPr>
-        <w:t xml:space="preserve">,* бо ти показався воістину і від пророків чесніший,* бо у </w:t>
-      </w:r>
-      <w:proofErr w:type="spellStart"/>
-      <w:r>
-        <w:rPr>
-          <w:rFonts w:ascii="Times New Roman" w:eastAsia="Times New Roman" w:hAnsi="Times New Roman" w:cs="Times New Roman"/>
-          <w:sz w:val="24"/>
-          <w:szCs w:val="24"/>
-        </w:rPr>
-        <w:t>струях</w:t>
-      </w:r>
-      <w:proofErr w:type="spellEnd"/>
-      <w:r>
-        <w:rPr>
-          <w:rFonts w:ascii="Times New Roman" w:eastAsia="Times New Roman" w:hAnsi="Times New Roman" w:cs="Times New Roman"/>
-          <w:sz w:val="24"/>
-          <w:szCs w:val="24"/>
-        </w:rPr>
-        <w:t xml:space="preserve"> </w:t>
-      </w:r>
-      <w:proofErr w:type="spellStart"/>
-      <w:r>
-        <w:rPr>
-          <w:rFonts w:ascii="Times New Roman" w:eastAsia="Times New Roman" w:hAnsi="Times New Roman" w:cs="Times New Roman"/>
-          <w:sz w:val="24"/>
-          <w:szCs w:val="24"/>
-        </w:rPr>
-        <w:t>сподобився</w:t>
-      </w:r>
-      <w:proofErr w:type="spellEnd"/>
-      <w:r>
-        <w:rPr>
-          <w:rFonts w:ascii="Times New Roman" w:eastAsia="Times New Roman" w:hAnsi="Times New Roman" w:cs="Times New Roman"/>
-          <w:sz w:val="24"/>
-          <w:szCs w:val="24"/>
-        </w:rPr>
-        <w:t xml:space="preserve"> хрестити Проповіданого.* Тому за істину постраждав ти, </w:t>
-      </w:r>
-      <w:proofErr w:type="spellStart"/>
-      <w:r>
-        <w:rPr>
-          <w:rFonts w:ascii="Times New Roman" w:eastAsia="Times New Roman" w:hAnsi="Times New Roman" w:cs="Times New Roman"/>
-          <w:sz w:val="24"/>
-          <w:szCs w:val="24"/>
-        </w:rPr>
-        <w:t>радуючися</w:t>
-      </w:r>
-      <w:proofErr w:type="spellEnd"/>
-      <w:r>
-        <w:rPr>
-          <w:rFonts w:ascii="Times New Roman" w:eastAsia="Times New Roman" w:hAnsi="Times New Roman" w:cs="Times New Roman"/>
-          <w:sz w:val="24"/>
-          <w:szCs w:val="24"/>
-        </w:rPr>
-        <w:t>,* благовістив ти і тим, що в аді, Бога, явленого в тілі,* що взяв гріх світу і подає нам велику милість.</w:t>
+        <w:t>Пам’ять праведного з похвалами,* і тобі вистачає свідчення Господнє, Предтече,* бо ти показався воістину і від пророків чесніший,* бо у струях сподобився хрестити Проповіданого.* Тому за істину постраждав ти, радуючися,* благовістив ти і тим, що в аді, Бога, явленого в тілі,* що взяв гріх світу і подає нам велику милість.</w:t>
       </w:r>
     </w:p>
     <w:p>
@@ -2220,61 +1836,7 @@
           <w:sz w:val="24"/>
           <w:szCs w:val="24"/>
         </w:rPr>
-        <w:t xml:space="preserve">Ірод, </w:t>
-      </w:r>
-      <w:proofErr w:type="spellStart"/>
-      <w:r>
-        <w:rPr>
-          <w:rFonts w:ascii="Times New Roman" w:eastAsia="Times New Roman" w:hAnsi="Times New Roman" w:cs="Times New Roman"/>
-          <w:sz w:val="24"/>
-          <w:szCs w:val="24"/>
-        </w:rPr>
-        <w:t>Предтече</w:t>
-      </w:r>
-      <w:proofErr w:type="spellEnd"/>
-      <w:r>
-        <w:rPr>
-          <w:rFonts w:ascii="Times New Roman" w:eastAsia="Times New Roman" w:hAnsi="Times New Roman" w:cs="Times New Roman"/>
-          <w:sz w:val="24"/>
-          <w:szCs w:val="24"/>
-        </w:rPr>
-        <w:t xml:space="preserve">, беззаконня вчинив* і дав </w:t>
-      </w:r>
-      <w:proofErr w:type="spellStart"/>
-      <w:r>
-        <w:rPr>
-          <w:rFonts w:ascii="Times New Roman" w:eastAsia="Times New Roman" w:hAnsi="Times New Roman" w:cs="Times New Roman"/>
-          <w:sz w:val="24"/>
-          <w:szCs w:val="24"/>
-        </w:rPr>
-        <w:t>жоні</w:t>
-      </w:r>
-      <w:proofErr w:type="spellEnd"/>
-      <w:r>
-        <w:rPr>
-          <w:rFonts w:ascii="Times New Roman" w:eastAsia="Times New Roman" w:hAnsi="Times New Roman" w:cs="Times New Roman"/>
-          <w:sz w:val="24"/>
-          <w:szCs w:val="24"/>
-        </w:rPr>
-        <w:t xml:space="preserve"> твою голову чесну,* якій кланяємося й тішимося,* а </w:t>
-      </w:r>
-      <w:proofErr w:type="spellStart"/>
-      <w:r>
-        <w:rPr>
-          <w:rFonts w:ascii="Times New Roman" w:eastAsia="Times New Roman" w:hAnsi="Times New Roman" w:cs="Times New Roman"/>
-          <w:sz w:val="24"/>
-          <w:szCs w:val="24"/>
-        </w:rPr>
-        <w:t>Іродіяда</w:t>
-      </w:r>
-      <w:proofErr w:type="spellEnd"/>
-      <w:r>
-        <w:rPr>
-          <w:rFonts w:ascii="Times New Roman" w:eastAsia="Times New Roman" w:hAnsi="Times New Roman" w:cs="Times New Roman"/>
-          <w:sz w:val="24"/>
-          <w:szCs w:val="24"/>
-        </w:rPr>
-        <w:t xml:space="preserve"> плаче,* і ридають і Ірод, і танечниця.</w:t>
+        <w:t>Ірод, Предтече, беззаконня вчинив* і дав жоні твою голову чесну,* якій кланяємося й тішимося,* а Іродіяда плаче,* і ридають і Ірод, і танечниця.</w:t>
       </w:r>
     </w:p>
     <w:bookmarkEnd w:id="17"/>
@@ -2692,14 +2254,15 @@
     <w:lsdException w:name="Unresolved Mention" w:semiHidden="1" w:unhideWhenUsed="1"/>
     <w:lsdException w:name="Smart Link" w:semiHidden="1" w:unhideWhenUsed="1"/>
   </w:latentStyles>
-  <w:style w:type="paragraph" w:default="1" w:styleId="a">
+  <w:style w:type="paragraph" w:default="1" w:styleId="Normal">
     <w:name w:val="Normal"/>
     <w:qFormat/>
+    <w:rsid w:val="006C642A"/>
   </w:style>
-  <w:style w:type="paragraph" w:styleId="1">
+  <w:style w:type="paragraph" w:styleId="Heading1">
     <w:name w:val="heading 1"/>
-    <w:basedOn w:val="a"/>
-    <w:next w:val="a"/>
+    <w:basedOn w:val="Normal"/>
+    <w:next w:val="Normal"/>
     <w:uiPriority w:val="9"/>
     <w:qFormat/>
     <w:pPr>
@@ -2714,10 +2277,10 @@
       <w:szCs w:val="48"/>
     </w:rPr>
   </w:style>
-  <w:style w:type="paragraph" w:styleId="2">
+  <w:style w:type="paragraph" w:styleId="Heading2">
     <w:name w:val="heading 2"/>
-    <w:basedOn w:val="a"/>
-    <w:next w:val="a"/>
+    <w:basedOn w:val="Normal"/>
+    <w:next w:val="Normal"/>
     <w:uiPriority w:val="9"/>
     <w:unhideWhenUsed/>
     <w:qFormat/>
@@ -2733,10 +2296,10 @@
       <w:szCs w:val="36"/>
     </w:rPr>
   </w:style>
-  <w:style w:type="paragraph" w:styleId="3">
+  <w:style w:type="paragraph" w:styleId="Heading3">
     <w:name w:val="heading 3"/>
-    <w:basedOn w:val="a"/>
-    <w:next w:val="a"/>
+    <w:basedOn w:val="Normal"/>
+    <w:next w:val="Normal"/>
     <w:uiPriority w:val="9"/>
     <w:semiHidden/>
     <w:unhideWhenUsed/>
@@ -2753,10 +2316,10 @@
       <w:szCs w:val="28"/>
     </w:rPr>
   </w:style>
-  <w:style w:type="paragraph" w:styleId="4">
+  <w:style w:type="paragraph" w:styleId="Heading4">
     <w:name w:val="heading 4"/>
-    <w:basedOn w:val="a"/>
-    <w:next w:val="a"/>
+    <w:basedOn w:val="Normal"/>
+    <w:next w:val="Normal"/>
     <w:uiPriority w:val="9"/>
     <w:semiHidden/>
     <w:unhideWhenUsed/>
@@ -2773,10 +2336,10 @@
       <w:szCs w:val="24"/>
     </w:rPr>
   </w:style>
-  <w:style w:type="paragraph" w:styleId="5">
+  <w:style w:type="paragraph" w:styleId="Heading5">
     <w:name w:val="heading 5"/>
-    <w:basedOn w:val="a"/>
-    <w:next w:val="a"/>
+    <w:basedOn w:val="Normal"/>
+    <w:next w:val="Normal"/>
     <w:uiPriority w:val="9"/>
     <w:semiHidden/>
     <w:unhideWhenUsed/>
@@ -2791,10 +2354,10 @@
       <w:b/>
     </w:rPr>
   </w:style>
-  <w:style w:type="paragraph" w:styleId="6">
+  <w:style w:type="paragraph" w:styleId="Heading6">
     <w:name w:val="heading 6"/>
-    <w:basedOn w:val="a"/>
-    <w:next w:val="a"/>
+    <w:basedOn w:val="Normal"/>
+    <w:next w:val="Normal"/>
     <w:uiPriority w:val="9"/>
     <w:semiHidden/>
     <w:unhideWhenUsed/>
@@ -2811,13 +2374,13 @@
       <w:szCs w:val="20"/>
     </w:rPr>
   </w:style>
-  <w:style w:type="character" w:default="1" w:styleId="a0">
+  <w:style w:type="character" w:default="1" w:styleId="DefaultParagraphFont">
     <w:name w:val="Default Paragraph Font"/>
     <w:uiPriority w:val="1"/>
     <w:semiHidden/>
     <w:unhideWhenUsed/>
   </w:style>
-  <w:style w:type="table" w:default="1" w:styleId="a1">
+  <w:style w:type="table" w:default="1" w:styleId="TableNormal">
     <w:name w:val="Normal Table"/>
     <w:uiPriority w:val="99"/>
     <w:semiHidden/>
@@ -2832,14 +2395,14 @@
       </w:tblCellMar>
     </w:tblPr>
   </w:style>
-  <w:style w:type="numbering" w:default="1" w:styleId="a2">
+  <w:style w:type="numbering" w:default="1" w:styleId="NoList">
     <w:name w:val="No List"/>
     <w:uiPriority w:val="99"/>
     <w:semiHidden/>
     <w:unhideWhenUsed/>
   </w:style>
-  <w:style w:type="table" w:customStyle="1" w:styleId="TableNormal">
-    <w:name w:val="Table Normal"/>
+  <w:style w:type="table" w:customStyle="1" w:styleId="TableNormal1">
+    <w:name w:val="Table Normal1"/>
     <w:tblPr>
       <w:tblCellMar>
         <w:top w:w="0" w:type="dxa"/>
@@ -2849,10 +2412,10 @@
       </w:tblCellMar>
     </w:tblPr>
   </w:style>
-  <w:style w:type="paragraph" w:styleId="a3">
+  <w:style w:type="paragraph" w:styleId="Title">
     <w:name w:val="Title"/>
-    <w:basedOn w:val="a"/>
-    <w:next w:val="a"/>
+    <w:basedOn w:val="Normal"/>
+    <w:next w:val="Normal"/>
     <w:uiPriority w:val="10"/>
     <w:qFormat/>
     <w:pPr>
@@ -2866,10 +2429,10 @@
       <w:szCs w:val="72"/>
     </w:rPr>
   </w:style>
-  <w:style w:type="paragraph" w:styleId="a4">
+  <w:style w:type="paragraph" w:styleId="Subtitle">
     <w:name w:val="Subtitle"/>
-    <w:basedOn w:val="a"/>
-    <w:next w:val="a"/>
+    <w:basedOn w:val="Normal"/>
+    <w:next w:val="Normal"/>
     <w:uiPriority w:val="11"/>
     <w:qFormat/>
     <w:pPr>

</xml_diff>